<commit_message>
checkpoint: KM02 v3 cleared, retrospective, KM03 inheritance
</commit_message>
<xml_diff>
--- a/worlds/korvin-merrow/task-setup/platform/task2/golden-KM02-v5.docx
+++ b/worlds/korvin-merrow/task-setup/platform/task2/golden-KM02-v5.docx
@@ -197,7 +197,7 @@
                 <w:color w:val="232830"/>
                 <w:sz w:val="16"/>
               </w:rPr>
-              <w:t>05/23/2026</w:t>
+              <w:t>05/24/2026</w:t>
             </w:r>
           </w:p>
         </w:tc>
@@ -430,7 +430,7 @@
           <w:color w:val="5E6670"/>
           <w:sz w:val="16"/>
         </w:rPr>
-        <w:t>Author: Elian Vossmere, MD  |  Department: Hospital Medicine  |  05/23/2026  |  Status: Signed</w:t>
+        <w:t>Author: Elian Vossmere, MD  |  Department: Hospital Medicine  |  05/24/2026  |  Status: Signed</w:t>
       </w:r>
     </w:p>
     <w:p>
@@ -798,6 +798,8 @@
     <w:sectPr>
       <w:headerReference w:type="default" r:id="rId9"/>
       <w:footerReference w:type="default" r:id="rId10"/>
+      <w:headerReference w:type="first" r:id="rId11"/>
+      <w:footerReference w:type="first" r:id="rId12"/>
       <w:pgSz w:w="12240" w:h="15840"/>
       <w:pgMar w:top="720" w:right="936" w:bottom="792" w:left="936" w:header="720" w:footer="720" w:gutter="0"/>
       <w:cols w:space="720"/>
@@ -828,6 +830,16 @@
 </w:ftr>
 </file>
 
+<file path=word/footer2.xml><?xml version="1.0" encoding="utf-8"?>
+<w:ftr xmlns:m="http://schemas.openxmlformats.org/officeDocument/2006/math" xmlns:mc="http://schemas.openxmlformats.org/markup-compatibility/2006" xmlns:mo="http://schemas.microsoft.com/office/mac/office/2008/main" xmlns:mv="urn:schemas-microsoft-com:mac:vml" xmlns:o="urn:schemas-microsoft-com:office:office" xmlns:r="http://schemas.openxmlformats.org/officeDocument/2006/relationships" xmlns:v="urn:schemas-microsoft-com:vml" xmlns:w10="urn:schemas-microsoft-com:office:word" xmlns:w14="http://schemas.microsoft.com/office/word/2010/wordml" xmlns:w="http://schemas.openxmlformats.org/wordprocessingml/2006/main" xmlns:wne="http://schemas.microsoft.com/office/word/2006/wordml" xmlns:wp14="http://schemas.microsoft.com/office/word/2010/wordprocessingDrawing" xmlns:wp="http://schemas.openxmlformats.org/drawingml/2006/wordprocessingDrawing" xmlns:wpc="http://schemas.microsoft.com/office/word/2010/wordprocessingCanvas" xmlns:wpg="http://schemas.microsoft.com/office/word/2010/wordprocessingGroup" xmlns:wpi="http://schemas.microsoft.com/office/word/2010/wordprocessingInk" xmlns:wps="http://schemas.microsoft.com/office/word/2010/wordprocessingShape" mc:Ignorable="w14 wp14">
+  <w:p>
+    <w:pPr>
+      <w:pStyle w:val="Footer"/>
+    </w:pPr>
+  </w:p>
+</w:ftr>
+</file>
+
 <file path=word/header1.xml><?xml version="1.0" encoding="utf-8"?>
 <w:hdr xmlns:m="http://schemas.openxmlformats.org/officeDocument/2006/math" xmlns:mc="http://schemas.openxmlformats.org/markup-compatibility/2006" xmlns:mo="http://schemas.microsoft.com/office/mac/office/2008/main" xmlns:mv="urn:schemas-microsoft-com:mac:vml" xmlns:o="urn:schemas-microsoft-com:office:office" xmlns:r="http://schemas.openxmlformats.org/officeDocument/2006/relationships" xmlns:v="urn:schemas-microsoft-com:vml" xmlns:w10="urn:schemas-microsoft-com:office:word" xmlns:w14="http://schemas.microsoft.com/office/word/2010/wordml" xmlns:w="http://schemas.openxmlformats.org/wordprocessingml/2006/main" xmlns:wne="http://schemas.microsoft.com/office/word/2006/wordml" xmlns:wp14="http://schemas.microsoft.com/office/word/2010/wordprocessingDrawing" xmlns:wp="http://schemas.openxmlformats.org/drawingml/2006/wordprocessingDrawing" xmlns:wpc="http://schemas.microsoft.com/office/word/2010/wordprocessingCanvas" xmlns:wpg="http://schemas.microsoft.com/office/word/2010/wordprocessingGroup" xmlns:wpi="http://schemas.microsoft.com/office/word/2010/wordprocessingInk" xmlns:wps="http://schemas.microsoft.com/office/word/2010/wordprocessingShape" mc:Ignorable="w14 wp14">
   <w:p>
@@ -844,6 +856,16 @@
       </w:rPr>
       <w:t>Korvin Merrow  |  MRN KM-6427819</w:t>
     </w:r>
+  </w:p>
+</w:hdr>
+</file>
+
+<file path=word/header2.xml><?xml version="1.0" encoding="utf-8"?>
+<w:hdr xmlns:m="http://schemas.openxmlformats.org/officeDocument/2006/math" xmlns:mc="http://schemas.openxmlformats.org/markup-compatibility/2006" xmlns:mo="http://schemas.microsoft.com/office/mac/office/2008/main" xmlns:mv="urn:schemas-microsoft-com:mac:vml" xmlns:o="urn:schemas-microsoft-com:office:office" xmlns:r="http://schemas.openxmlformats.org/officeDocument/2006/relationships" xmlns:v="urn:schemas-microsoft-com:vml" xmlns:w10="urn:schemas-microsoft-com:office:word" xmlns:w14="http://schemas.microsoft.com/office/word/2010/wordml" xmlns:w="http://schemas.openxmlformats.org/wordprocessingml/2006/main" xmlns:wne="http://schemas.microsoft.com/office/word/2006/wordml" xmlns:wp14="http://schemas.microsoft.com/office/word/2010/wordprocessingDrawing" xmlns:wp="http://schemas.openxmlformats.org/drawingml/2006/wordprocessingDrawing" xmlns:wpc="http://schemas.microsoft.com/office/word/2010/wordprocessingCanvas" xmlns:wpg="http://schemas.microsoft.com/office/word/2010/wordprocessingGroup" xmlns:wpi="http://schemas.microsoft.com/office/word/2010/wordprocessingInk" xmlns:wps="http://schemas.microsoft.com/office/word/2010/wordprocessingShape" mc:Ignorable="w14 wp14">
+  <w:p>
+    <w:pPr>
+      <w:pStyle w:val="Header"/>
+    </w:pPr>
   </w:p>
 </w:hdr>
 </file>

</xml_diff>